<commit_message>
docs: finalize 4 review docs with pure black text, 1.5 spacing, and concise 2-page modules
</commit_message>
<xml_diff>
--- a/First_Review_Documents/Topic1_Abstract.docx
+++ b/First_Review_Documents/Topic1_Abstract.docx
@@ -4,126 +4,100 @@
   <w:body>
     <w:p>
       <w:pPr>
-        <w:spacing w:before="0" w:after="40"/>
-        <w:jc w:val="left"/>
+        <w:spacing w:before="0" w:after="40" w:line="276" w:lineRule="auto"/>
+        <w:jc w:val="center"/>
       </w:pPr>
       <w:r>
         <w:rPr>
           <w:rFonts w:ascii="Times New Roman" w:hAnsi="Times New Roman"/>
           <w:b/>
-          <w:color w:val="1E3A8A"/>
-          <w:sz w:val="44"/>
+          <w:color w:val="000000"/>
+          <w:sz w:val="30"/>
+        </w:rPr>
+        <w:t>COMMUNITY LENDING PLATFORM FOR SHARING AND BORROWING HOUSEHOLD RESOURCES</w:t>
+      </w:r>
+    </w:p>
+    <w:p>
+      <w:pPr>
+        <w:spacing w:before="0" w:after="240" w:line="276" w:lineRule="auto"/>
+        <w:jc w:val="center"/>
+      </w:pPr>
+      <w:r>
+        <w:rPr>
+          <w:rFonts w:ascii="Times New Roman" w:hAnsi="Times New Roman"/>
+          <w:i/>
+          <w:color w:val="000000"/>
+          <w:sz w:val="22"/>
+        </w:rPr>
+        <w:t>Project Synopsis &amp; Abstract — First Review</w:t>
+      </w:r>
+    </w:p>
+    <w:p>
+      <w:pPr>
+        <w:spacing w:before="80" w:after="160"/>
+        <w:jc w:val="center"/>
+      </w:pPr>
+      <w:r>
+        <w:rPr>
+          <w:rFonts w:ascii="Times New Roman" w:hAnsi="Times New Roman"/>
+          <w:b/>
+          <w:color w:val="000000"/>
+          <w:sz w:val="28"/>
         </w:rPr>
         <w:t>ABSTRACT</w:t>
       </w:r>
     </w:p>
     <w:p>
       <w:pPr>
-        <w:spacing w:before="0" w:after="280"/>
-        <w:jc w:val="left"/>
+        <w:spacing w:line="360" w:lineRule="auto" w:after="100"/>
+        <w:jc w:val="both"/>
       </w:pPr>
       <w:r>
         <w:rPr>
           <w:rFonts w:ascii="Times New Roman" w:hAnsi="Times New Roman"/>
-          <w:i/>
-          <w:color w:val="64748B"/>
-          <w:sz w:val="22"/>
+          <w:color w:val="000000"/>
+          <w:sz w:val="24"/>
         </w:rPr>
-        <w:t>Project Work: Community Lending Platform for Sharing and Borrowing Household Resources</w:t>
+        <w:t>In modern urban and residential societies, households routinely invest significant financial resources into acquiring high-utility physical items—such as electrical power tools, lawn care equipment, specialized electronics, academic textbooks, and camping gear—that are utilized for only a tiny fraction of their operational lifespan. This consumerist dynamic imposes recurring financial burdens on individuals, promotes domestic clutter, and accelerates carbon emissions and industrial landfill waste through unnecessary mass production. The Community Lending Platform is a full-stack, cloud-integrated collaborative software system engineered to transition residential communities from an ownership-centric model to a sustainable, hyper-local access economy.</w:t>
       </w:r>
     </w:p>
     <w:p>
       <w:pPr>
-        <w:keepNext/>
-        <w:spacing w:before="280" w:after="80"/>
+        <w:spacing w:line="360" w:lineRule="auto" w:after="100"/>
+        <w:jc w:val="both"/>
+      </w:pPr>
+      <w:r>
+        <w:rPr>
+          <w:rFonts w:ascii="Times New Roman" w:hAnsi="Times New Roman"/>
+          <w:color w:val="000000"/>
+          <w:sz w:val="24"/>
+        </w:rPr>
+        <w:t>The platform provides a centralized, authenticated medium through which community members catalog, list, and verify items they are willing to share with neighbors. A major functional highlight is the integrated photographic verification engine, allowing owners to capture and attach real-time photos of items during listing, thereby ensuring transparency regarding physical condition and authenticity. Borrowers can explore an interactive catalog equipped with real-time keyword search and category filtering, submit structured borrow requests, and coordinate pickups directly with item owners.</w:t>
+      </w:r>
+    </w:p>
+    <w:p>
+      <w:pPr>
+        <w:spacing w:line="360" w:lineRule="auto" w:after="100"/>
+        <w:jc w:val="both"/>
+      </w:pPr>
+      <w:r>
+        <w:rPr>
+          <w:rFonts w:ascii="Times New Roman" w:hAnsi="Times New Roman"/>
+          <w:color w:val="000000"/>
+          <w:sz w:val="24"/>
+        </w:rPr>
+        <w:t>To ensure operational integrity, the platform implements a deterministic finite state machine governing the lending request lifecycle across discrete stages: Pending, Approved, Rejected, and Returned. The system enforces strict atomic consistency, automatically toggling resource availability between 'Available' and 'Lent' to eliminate concurrent scheduling conflicts. Developed utilizing Python (Flask), a high-availability cloud database (TiDB Serverless MySQL with TLS encryption), and a responsive web frontend adhering to modern design principles, the architecture also exposes a standardized JSON REST API to support native mobile client extensions. The platform fosters social cohesion, neighborhood trust, economic frugality, and circular environmental sustainability.</w:t>
+      </w:r>
+    </w:p>
+    <w:p>
+      <w:pPr>
+        <w:spacing w:before="160" w:after="0" w:line="312" w:lineRule="auto"/>
       </w:pPr>
       <w:r>
         <w:rPr>
           <w:rFonts w:ascii="Times New Roman" w:hAnsi="Times New Roman"/>
           <w:b/>
-          <w:color w:val="1E3A8A"/>
-          <w:sz w:val="28"/>
-        </w:rPr>
-        <w:t>1. Project Overview &amp; Socioeconomic Context</w:t>
-      </w:r>
-    </w:p>
-    <w:p>
-      <w:pPr>
-        <w:spacing w:line="300" w:lineRule="auto" w:after="120"/>
-        <w:jc w:val="both"/>
-      </w:pPr>
-      <w:r>
-        <w:rPr>
-          <w:rFonts w:ascii="Times New Roman" w:hAnsi="Times New Roman"/>
-          <w:sz w:val="24"/>
-        </w:rPr>
-        <w:t>In contemporary residential societies, urban apartment complexes, and suburban neighborhoods, households continuously expend substantial financial resources purchasing durable physical items—including electrical power tools, lawn care equipment, specialized electronics, sports equipment, and academic reference literature—that are utilized for only a tiny fraction of their operational lifespan. This rampant consumerist dynamic leads to significant financial waste for families, domestic clutter, and accelerated industrial carbon emissions caused by unnecessary mass manufacturing. The Community Lending Platform is a full-stack, cloud-integrated collaborative software ecosystem engineered to transition residential communities from an ownership-centric paradigm into a sustainable, hyper-local access economy.</w:t>
-      </w:r>
-    </w:p>
-    <w:p>
-      <w:pPr>
-        <w:keepNext/>
-        <w:spacing w:before="280" w:after="80"/>
-      </w:pPr>
-      <w:r>
-        <w:rPr>
-          <w:rFonts w:ascii="Times New Roman" w:hAnsi="Times New Roman"/>
-          <w:b/>
-          <w:color w:val="1E3A8A"/>
-          <w:sz w:val="28"/>
-        </w:rPr>
-        <w:t>2. Objectives, Photographic Verification &amp; Core Accomplishments</w:t>
-      </w:r>
-    </w:p>
-    <w:p>
-      <w:pPr>
-        <w:spacing w:line="300" w:lineRule="auto" w:after="120"/>
-        <w:jc w:val="both"/>
-      </w:pPr>
-      <w:r>
-        <w:rPr>
-          <w:rFonts w:ascii="Times New Roman" w:hAnsi="Times New Roman"/>
-          <w:sz w:val="24"/>
-        </w:rPr>
-        <w:t>The primary objective of this project is to provide a secure, authenticated digital platform enabling community members to catalog, list, and verify items they are willing to share with neighbors. A major functional milestone accomplished is the integration of an end-to-end photographic verification pipeline, allowing owners to capture and attach real-time photos of items during listing, ensuring condition transparency and eliminating disputes. Borrowers can seamlessly discover resources via live search and category filtering, transmit structured borrow requests, and coordinate physical exchanges.</w:t>
-      </w:r>
-    </w:p>
-    <w:p>
-      <w:pPr>
-        <w:keepNext/>
-        <w:spacing w:before="280" w:after="80"/>
-      </w:pPr>
-      <w:r>
-        <w:rPr>
-          <w:rFonts w:ascii="Times New Roman" w:hAnsi="Times New Roman"/>
-          <w:b/>
-          <w:color w:val="1E3A8A"/>
-          <w:sz w:val="28"/>
-        </w:rPr>
-        <w:t>3. System Architecture, Finite State Workflows &amp; Impact</w:t>
-      </w:r>
-    </w:p>
-    <w:p>
-      <w:pPr>
-        <w:spacing w:line="300" w:lineRule="auto" w:after="120"/>
-        <w:jc w:val="both"/>
-      </w:pPr>
-      <w:r>
-        <w:rPr>
-          <w:rFonts w:ascii="Times New Roman" w:hAnsi="Times New Roman"/>
-          <w:sz w:val="24"/>
-        </w:rPr>
-        <w:t>To preserve data integrity, the system implements a deterministic finite state machine governing lending lifecycles across discrete stages: Pending, Approved, Rejected, and Returned. The system enforces atomic consistency, automatically toggling resource availability between 'Available' and 'Lent' to eliminate duplicate booking conflicts. Developed using Python (Flask), a high-availability cloud database (TiDB Serverless MySQL with TLS encryption), and a responsive modern web UI, the platform also exposes a standardized JSON REST API supporting native mobile client extensions. The platform fosters social bonding, financial frugality, and circular economic sustainability.</w:t>
-      </w:r>
-    </w:p>
-    <w:p>
-      <w:pPr>
-        <w:spacing w:before="200" w:after="0"/>
-      </w:pPr>
-      <w:r>
-        <w:rPr>
-          <w:rFonts w:ascii="Times New Roman" w:hAnsi="Times New Roman"/>
-          <w:b/>
+          <w:color w:val="000000"/>
           <w:sz w:val="22"/>
         </w:rPr>
         <w:t xml:space="preserve">Keywords: </w:t>
@@ -132,6 +106,7 @@
         <w:rPr>
           <w:rFonts w:ascii="Times New Roman" w:hAnsi="Times New Roman"/>
           <w:i/>
+          <w:color w:val="000000"/>
           <w:sz w:val="22"/>
         </w:rPr>
         <w:t>Collaborative Consumption, Resource Sharing, Circular Economy, Cloud MySQL, Python Flask, Photo Verification, State Machine, REST API.</w:t>
@@ -158,8 +133,8 @@
     <w:r>
       <w:rPr>
         <w:rFonts w:ascii="Times New Roman" w:hAnsi="Times New Roman"/>
-        <w:color w:val="787878"/>
-        <w:sz w:val="17"/>
+        <w:color w:val="000000"/>
+        <w:sz w:val="18"/>
       </w:rPr>
       <w:t>First Review Report — Abstract</w:t>
     </w:r>
@@ -532,7 +507,7 @@
     <w:rsid w:val="00FC693F"/>
     <w:rPr>
       <w:rFonts w:ascii="Times New Roman" w:hAnsi="Times New Roman"/>
-      <w:color w:val="1E1E1E"/>
+      <w:color w:val="000000"/>
       <w:sz w:val="24"/>
     </w:rPr>
   </w:style>

</xml_diff>

<commit_message>
docs: rewrite all 4 review documents in simple, easy-to-understand student-friendly English
</commit_message>
<xml_diff>
--- a/First_Review_Documents/Topic1_Abstract.docx
+++ b/First_Review_Documents/Topic1_Abstract.docx
@@ -58,7 +58,7 @@
           <w:color w:val="000000"/>
           <w:sz w:val="24"/>
         </w:rPr>
-        <w:t>In modern urban and residential societies, households routinely invest significant financial resources into acquiring high-utility physical items—such as electrical power tools, lawn care equipment, specialized electronics, academic textbooks, and camping gear—that are utilized for only a tiny fraction of their operational lifespan. This consumerist dynamic imposes recurring financial burdens on individuals, promotes domestic clutter, and accelerates carbon emissions and industrial landfill waste through unnecessary mass production. The Community Lending Platform is a full-stack, cloud-integrated collaborative software system engineered to transition residential communities from an ownership-centric model to a sustainable, hyper-local access economy.</w:t>
+        <w:t>In many neighborhoods and apartment complexes, people spend a lot of money purchasing items like drilling machines, toolboxes, lawnmowers, books, and sports gear. Most of these items are needed only once or twice a year and then stay locked away in cupboards or storage rooms. Buying all these items individually wastes money for families, creates clutter at home, and harms the environment because companies keep producing new products that people rarely use. The Community Lending Platform is a web-based system designed to solve this problem by helping neighbors share and borrow household resources easily.</w:t>
       </w:r>
     </w:p>
     <w:p>
@@ -72,7 +72,7 @@
           <w:color w:val="000000"/>
           <w:sz w:val="24"/>
         </w:rPr>
-        <w:t>The platform provides a centralized, authenticated medium through which community members catalog, list, and verify items they are willing to share with neighbors. A major functional highlight is the integrated photographic verification engine, allowing owners to capture and attach real-time photos of items during listing, thereby ensuring transparency regarding physical condition and authenticity. Borrowers can explore an interactive catalog equipped with real-time keyword search and category filtering, submit structured borrow requests, and coordinate pickups directly with item owners.</w:t>
+        <w:t>The platform allows verified community members to list the items they own and are willing to share. A major feature of the project is the photo upload system, where owners can take and upload clear pictures of their items. This allows borrowers to see the actual condition and working state of an item before requesting it. Borrowers can easily search for items using keywords or category filters, send a borrow request with one click, and coordinate pickup directly with the owner.</w:t>
       </w:r>
     </w:p>
     <w:p>
@@ -86,7 +86,7 @@
           <w:color w:val="000000"/>
           <w:sz w:val="24"/>
         </w:rPr>
-        <w:t>To ensure operational integrity, the platform implements a deterministic finite state machine governing the lending request lifecycle across discrete stages: Pending, Approved, Rejected, and Returned. The system enforces strict atomic consistency, automatically toggling resource availability between 'Available' and 'Lent' to eliminate concurrent scheduling conflicts. Developed utilizing Python (Flask), a high-availability cloud database (TiDB Serverless MySQL with TLS encryption), and a responsive web frontend adhering to modern design principles, the architecture also exposes a standardized JSON REST API to support native mobile client extensions. The platform fosters social cohesion, neighborhood trust, economic frugality, and circular environmental sustainability.</w:t>
+        <w:t>The system automatically manages the entire lending and return process. When an owner approves a borrow request, the item is marked as 'Lent' so that no one else can request it at the same time. Once the borrower finishes using the item and returns it, the status updates back to 'Available', and the details are saved in the transaction history. The project is built using Python Flask, an online MySQL database (TiDB Serverless), and a responsive web interface that works on both computers and mobile phones. This platform saves money for families, builds trust among neighbors, and protects the environment through resource sharing.</w:t>
       </w:r>
     </w:p>
     <w:p>
@@ -109,7 +109,7 @@
           <w:color w:val="000000"/>
           <w:sz w:val="22"/>
         </w:rPr>
-        <w:t>Collaborative Consumption, Resource Sharing, Circular Economy, Cloud MySQL, Python Flask, Photo Verification, State Machine, REST API.</w:t>
+        <w:t>Resource Sharing, Community Lending, Item Borrowing, Photo Upload, Web Application, Python Flask, Cloud Database.</w:t>
       </w:r>
     </w:p>
     <w:sectPr>

</xml_diff>

<commit_message>
docs: update review documents for UORDMS in simple English with 1.5 spacing and black text
</commit_message>
<xml_diff>
--- a/First_Review_Documents/Topic1_Abstract.docx
+++ b/First_Review_Documents/Topic1_Abstract.docx
@@ -14,7 +14,7 @@
           <w:color w:val="000000"/>
           <w:sz w:val="30"/>
         </w:rPr>
-        <w:t>COMMUNITY LENDING PLATFORM FOR SHARING AND BORROWING HOUSEHOLD RESOURCES</w:t>
+        <w:t>UNUSED OFFICE RESOURCE DONATION MANAGEMENT SYSTEM (UORDMS)</w:t>
       </w:r>
     </w:p>
     <w:p>
@@ -29,7 +29,7 @@
           <w:color w:val="000000"/>
           <w:sz w:val="22"/>
         </w:rPr>
-        <w:t>Project Synopsis &amp; Abstract — First Review</w:t>
+        <w:t>Project / Internship Synopsis &amp; Abstract — First Review</w:t>
       </w:r>
     </w:p>
     <w:p>
@@ -58,7 +58,7 @@
           <w:color w:val="000000"/>
           <w:sz w:val="24"/>
         </w:rPr>
-        <w:t>In many neighborhoods and apartment complexes, people spend a lot of money purchasing items like drilling machines, toolboxes, lawnmowers, books, and sports gear. Most of these items are needed only once or twice a year and then stay locked away in cupboards or storage rooms. Buying all these items individually wastes money for families, creates clutter at home, and harms the environment because companies keep producing new products that people rarely use. The Community Lending Platform is a web-based system designed to solve this problem by helping neighbors share and borrow household resources easily.</w:t>
+        <w:t>The Unused Office Resource Donation Management System (UORDMS) is a web-based software application developed to connect corporate companies that have surplus office equipment with non-profit organizations, government schools, charitable trusts, and community clinics that need them. Many corporate offices regularly replace functional computers, monitors, office chairs, conference tables, and stationery during renovations or upgrades. At the same time, schools and charitable institutions often lack the budget to buy basic office furniture or computers. UORDMS replaces slow, unorganized phone calls and emails with a clear, automated digital platform for donating unused office resources.</w:t>
       </w:r>
     </w:p>
     <w:p>
@@ -72,7 +72,7 @@
           <w:color w:val="000000"/>
           <w:sz w:val="24"/>
         </w:rPr>
-        <w:t>The platform allows verified community members to list the items they own and are willing to share. A major feature of the project is the photo upload system, where owners can take and upload clear pictures of their items. This allows borrowers to see the actual condition and working state of an item before requesting it. Borrowers can easily search for items using keywords or category filters, send a borrow request with one click, and coordinate pickup directly with the owner.</w:t>
+        <w:t>The main objective of this project is to build an easy-to-use platform that handles the entire donation process from start to finish. Companies can list their unused items with quantity, condition details (such as Excellent, Good, or Fair), and photos. Registered recipient organizations can browse available items, submit donation requests, and track the status of their requests in real time. The system automatically reserves items when a request is approved, preventing duplicate promises or stock errors.</w:t>
       </w:r>
     </w:p>
     <w:p>
@@ -86,7 +86,7 @@
           <w:color w:val="000000"/>
           <w:sz w:val="24"/>
         </w:rPr>
-        <w:t>The system automatically manages the entire lending and return process. When an owner approves a borrow request, the item is marked as 'Lent' so that no one else can request it at the same time. Once the borrower finishes using the item and returns it, the status updates back to 'Available', and the details are saved in the transaction history. The project is built using Python Flask, an online MySQL database (TiDB Serverless), and a responsive web interface that works on both computers and mobile phones. This platform saves money for families, builds trust among neighbors, and protects the environment through resource sharing.</w:t>
+        <w:t>During this initial phase of the project, major accomplishments include setting up the relational MySQL database, implementing secure user logins with role-based access for admins and organizations, creating resource inventory management with image uploads and stock calculations, and developing a structured request workflow with automatic status updates. The application is built using Python Flask, MySQL, HTML5, CSS3, and JavaScript. This platform eliminates office waste, helps under-funded institutions, and ensures transparent donation tracking for corporate social responsibility.</w:t>
       </w:r>
     </w:p>
     <w:p>
@@ -109,7 +109,7 @@
           <w:color w:val="000000"/>
           <w:sz w:val="22"/>
         </w:rPr>
-        <w:t>Resource Sharing, Community Lending, Item Borrowing, Photo Upload, Web Application, Python Flask, Cloud Database.</w:t>
+        <w:t>Resource Donation, Office Equipment, Inventory Management, Non-Profit Support, Python Flask, MySQL Database, Web Application.</w:t>
       </w:r>
     </w:p>
     <w:sectPr>

</xml_diff>

<commit_message>
docs: restore Community Lending Platform review docs in simple English with 1.5 spacing
</commit_message>
<xml_diff>
--- a/First_Review_Documents/Topic1_Abstract.docx
+++ b/First_Review_Documents/Topic1_Abstract.docx
@@ -14,7 +14,7 @@
           <w:color w:val="000000"/>
           <w:sz w:val="30"/>
         </w:rPr>
-        <w:t>UNUSED OFFICE RESOURCE DONATION MANAGEMENT SYSTEM (UORDMS)</w:t>
+        <w:t>COMMUNITY LENDING PLATFORM FOR SHARING AND BORROWING HOUSEHOLD RESOURCES</w:t>
       </w:r>
     </w:p>
     <w:p>
@@ -29,7 +29,7 @@
           <w:color w:val="000000"/>
           <w:sz w:val="22"/>
         </w:rPr>
-        <w:t>Project / Internship Synopsis &amp; Abstract — First Review</w:t>
+        <w:t>Project Synopsis &amp; Abstract — First Review</w:t>
       </w:r>
     </w:p>
     <w:p>
@@ -58,7 +58,7 @@
           <w:color w:val="000000"/>
           <w:sz w:val="24"/>
         </w:rPr>
-        <w:t>The Unused Office Resource Donation Management System (UORDMS) is a web-based software application developed to connect corporate companies that have surplus office equipment with non-profit organizations, government schools, charitable trusts, and community clinics that need them. Many corporate offices regularly replace functional computers, monitors, office chairs, conference tables, and stationery during renovations or upgrades. At the same time, schools and charitable institutions often lack the budget to buy basic office furniture or computers. UORDMS replaces slow, unorganized phone calls and emails with a clear, automated digital platform for donating unused office resources.</w:t>
+        <w:t>In many neighborhoods and apartment complexes, people spend a lot of money purchasing items like drilling machines, toolboxes, lawnmowers, books, and sports gear. Most of these items are needed only once or twice a year and then stay locked away in cupboards or storage rooms. Buying all these items individually wastes money for families, creates clutter at home, and harms the environment because companies keep producing new products that people rarely use. The Community Lending Platform is a web-based system designed to solve this problem by helping neighbors share and borrow household resources easily.</w:t>
       </w:r>
     </w:p>
     <w:p>
@@ -72,7 +72,7 @@
           <w:color w:val="000000"/>
           <w:sz w:val="24"/>
         </w:rPr>
-        <w:t>The main objective of this project is to build an easy-to-use platform that handles the entire donation process from start to finish. Companies can list their unused items with quantity, condition details (such as Excellent, Good, or Fair), and photos. Registered recipient organizations can browse available items, submit donation requests, and track the status of their requests in real time. The system automatically reserves items when a request is approved, preventing duplicate promises or stock errors.</w:t>
+        <w:t>The platform allows verified community members to list the items they own and are willing to share. A major feature of the project is the photo upload system, where owners can take and upload clear pictures of their items. This allows borrowers to see the actual condition and working state of an item before requesting it. Borrowers can easily search for items using keywords or category filters, send a borrow request with one click, and coordinate pickup directly with the owner.</w:t>
       </w:r>
     </w:p>
     <w:p>
@@ -86,7 +86,7 @@
           <w:color w:val="000000"/>
           <w:sz w:val="24"/>
         </w:rPr>
-        <w:t>During this initial phase of the project, major accomplishments include setting up the relational MySQL database, implementing secure user logins with role-based access for admins and organizations, creating resource inventory management with image uploads and stock calculations, and developing a structured request workflow with automatic status updates. The application is built using Python Flask, MySQL, HTML5, CSS3, and JavaScript. This platform eliminates office waste, helps under-funded institutions, and ensures transparent donation tracking for corporate social responsibility.</w:t>
+        <w:t>The system automatically manages the entire lending and return process. When an owner approves a borrow request, the item is marked as 'Lent' so that no one else can request it at the same time. Once the borrower finishes using the item and returns it, the status updates back to 'Available', and the details are saved in the transaction history. The project is built using Python Flask, an online MySQL database (TiDB Serverless), and a responsive web interface that works on both computers and mobile phones. This platform saves money for families, builds trust among neighbors, and protects the environment through resource sharing.</w:t>
       </w:r>
     </w:p>
     <w:p>
@@ -109,7 +109,7 @@
           <w:color w:val="000000"/>
           <w:sz w:val="22"/>
         </w:rPr>
-        <w:t>Resource Donation, Office Equipment, Inventory Management, Non-Profit Support, Python Flask, MySQL Database, Web Application.</w:t>
+        <w:t>Resource Sharing, Community Lending, Item Borrowing, Photo Upload, Web Application, Python Flask, Cloud Database.</w:t>
       </w:r>
     </w:p>
     <w:sectPr>

</xml_diff>